<commit_message>
Expanded guidelines to cover menu items, control texts Added Portuguese base translation
git-svn-id: https://sources.ecopath.org/svn/Ecopath/trunk/Ecopath6@16376 a725721c-0ed6-864e-a6a8-02c2a1988c9d
</commit_message>
<xml_diff>
--- a/Localization/Localizing EwE protocol.docx
+++ b/Localization/Localizing EwE protocol.docx
@@ -1,6 +1,6 @@
 
 <file path=word/document.xml><?xml version="1.0" encoding="utf-8"?>
-<w:document xmlns:wpc="http://schemas.microsoft.com/office/word/2010/wordprocessingCanvas" xmlns:cx="http://schemas.microsoft.com/office/drawing/2014/chartex" xmlns:cx1="http://schemas.microsoft.com/office/drawing/2015/9/8/chartex" xmlns:cx2="http://schemas.microsoft.com/office/drawing/2015/10/21/chartex" xmlns:cx3="http://schemas.microsoft.com/office/drawing/2016/5/9/chartex" xmlns:cx4="http://schemas.microsoft.com/office/drawing/2016/5/10/chartex" xmlns:cx5="http://schemas.microsoft.com/office/drawing/2016/5/11/chartex" xmlns:cx6="http://schemas.microsoft.com/office/drawing/2016/5/12/chartex" xmlns:cx7="http://schemas.microsoft.com/office/drawing/2016/5/13/chartex" xmlns:cx8="http://schemas.microsoft.com/office/drawing/2016/5/14/chartex" xmlns:mc="http://schemas.openxmlformats.org/markup-compatibility/2006" xmlns:aink="http://schemas.microsoft.com/office/drawing/2016/ink" xmlns:am3d="http://schemas.microsoft.com/office/drawing/2017/model3d" xmlns:o="urn:schemas-microsoft-com:office:office" xmlns:r="http://schemas.openxmlformats.org/officeDocument/2006/relationships" xmlns:m="http://schemas.openxmlformats.org/officeDocument/2006/math" xmlns:v="urn:schemas-microsoft-com:vml" xmlns:wp14="http://schemas.microsoft.com/office/word/2010/wordprocessingDrawing" xmlns:wp="http://schemas.openxmlformats.org/drawingml/2006/wordprocessingDrawing" xmlns:w10="urn:schemas-microsoft-com:office:word" xmlns:w="http://schemas.openxmlformats.org/wordprocessingml/2006/main" xmlns:w14="http://schemas.microsoft.com/office/word/2010/wordml" xmlns:w15="http://schemas.microsoft.com/office/word/2012/wordml" xmlns:w16cid="http://schemas.microsoft.com/office/word/2016/wordml/cid" xmlns:w16se="http://schemas.microsoft.com/office/word/2015/wordml/symex" xmlns:wpg="http://schemas.microsoft.com/office/word/2010/wordprocessingGroup" xmlns:wpi="http://schemas.microsoft.com/office/word/2010/wordprocessingInk" xmlns:wne="http://schemas.microsoft.com/office/word/2006/wordml" xmlns:wps="http://schemas.microsoft.com/office/word/2010/wordprocessingShape" mc:Ignorable="w14 w15 w16se w16cid wp14">
+<w:document xmlns:wpc="http://schemas.microsoft.com/office/word/2010/wordprocessingCanvas" xmlns:cx="http://schemas.microsoft.com/office/drawing/2014/chartex" xmlns:cx1="http://schemas.microsoft.com/office/drawing/2015/9/8/chartex" xmlns:mc="http://schemas.openxmlformats.org/markup-compatibility/2006" xmlns:o="urn:schemas-microsoft-com:office:office" xmlns:r="http://schemas.openxmlformats.org/officeDocument/2006/relationships" xmlns:m="http://schemas.openxmlformats.org/officeDocument/2006/math" xmlns:v="urn:schemas-microsoft-com:vml" xmlns:wp14="http://schemas.microsoft.com/office/word/2010/wordprocessingDrawing" xmlns:wp="http://schemas.openxmlformats.org/drawingml/2006/wordprocessingDrawing" xmlns:w10="urn:schemas-microsoft-com:office:word" xmlns:w="http://schemas.openxmlformats.org/wordprocessingml/2006/main" xmlns:w14="http://schemas.microsoft.com/office/word/2010/wordml" xmlns:w15="http://schemas.microsoft.com/office/word/2012/wordml" xmlns:w16se="http://schemas.microsoft.com/office/word/2015/wordml/symex" xmlns:wpg="http://schemas.microsoft.com/office/word/2010/wordprocessingGroup" xmlns:wpi="http://schemas.microsoft.com/office/word/2010/wordprocessingInk" xmlns:wne="http://schemas.microsoft.com/office/word/2006/wordml" xmlns:wps="http://schemas.microsoft.com/office/word/2010/wordprocessingShape" mc:Ignorable="w14 w15 w16se wp14">
   <w:body>
     <w:p>
       <w:pPr>
@@ -44,8 +44,13 @@
           <w:numId w:val="1"/>
         </w:numPr>
       </w:pPr>
-      <w:r>
-        <w:t xml:space="preserve">TortoiseSVN </w:t>
+      <w:proofErr w:type="spellStart"/>
+      <w:r>
+        <w:t>TortoiseSVN</w:t>
+      </w:r>
+      <w:proofErr w:type="spellEnd"/>
+      <w:r>
+        <w:t xml:space="preserve"> </w:t>
       </w:r>
     </w:p>
     <w:p>
@@ -68,9 +73,11 @@
           <w:numId w:val="1"/>
         </w:numPr>
       </w:pPr>
+      <w:proofErr w:type="spellStart"/>
       <w:r>
         <w:t>LSACreator</w:t>
       </w:r>
+      <w:proofErr w:type="spellEnd"/>
     </w:p>
     <w:p>
       <w:pPr>
@@ -80,8 +87,13 @@
           <w:numId w:val="1"/>
         </w:numPr>
       </w:pPr>
-      <w:r>
-        <w:t>LSACreator license</w:t>
+      <w:proofErr w:type="spellStart"/>
+      <w:r>
+        <w:t>LSACreator</w:t>
+      </w:r>
+      <w:proofErr w:type="spellEnd"/>
+      <w:r>
+        <w:t xml:space="preserve"> license</w:t>
       </w:r>
     </w:p>
     <w:p>
@@ -101,7 +113,15 @@
         </w:numPr>
       </w:pPr>
       <w:r>
-        <w:t>Install Visual Studio, TortoiseSVN, and obtain EwE source code</w:t>
+        <w:t xml:space="preserve">Install Visual Studio, </w:t>
+      </w:r>
+      <w:proofErr w:type="spellStart"/>
+      <w:r>
+        <w:t>TortoiseSVN</w:t>
+      </w:r>
+      <w:proofErr w:type="spellEnd"/>
+      <w:r>
+        <w:t>, and obtain EwE source code</w:t>
       </w:r>
       <w:r>
         <w:t xml:space="preserve"> (</w:t>
@@ -122,7 +142,15 @@
         </w:numPr>
       </w:pPr>
       <w:r>
-        <w:t>Install LSACreator (</w:t>
+        <w:t xml:space="preserve">Install </w:t>
+      </w:r>
+      <w:proofErr w:type="spellStart"/>
+      <w:r>
+        <w:t>LSACreator</w:t>
+      </w:r>
+      <w:proofErr w:type="spellEnd"/>
+      <w:r>
+        <w:t xml:space="preserve"> (</w:t>
       </w:r>
       <w:hyperlink r:id="rId5" w:history="1">
         <w:r>
@@ -145,7 +173,15 @@
         </w:numPr>
       </w:pPr>
       <w:r>
-        <w:t xml:space="preserve">Install LSACreator license </w:t>
+        <w:t xml:space="preserve">Install </w:t>
+      </w:r>
+      <w:proofErr w:type="spellStart"/>
+      <w:r>
+        <w:t>LSACreator</w:t>
+      </w:r>
+      <w:proofErr w:type="spellEnd"/>
+      <w:r>
+        <w:t xml:space="preserve"> license </w:t>
       </w:r>
     </w:p>
     <w:p>
@@ -177,8 +213,13 @@
         </w:numPr>
       </w:pPr>
       <w:r>
-        <w:t>Compile EwE in Release mode / AnyCPU</w:t>
-      </w:r>
+        <w:t xml:space="preserve">Compile EwE in Release mode / </w:t>
+      </w:r>
+      <w:proofErr w:type="spellStart"/>
+      <w:r>
+        <w:t>AnyCPU</w:t>
+      </w:r>
+      <w:proofErr w:type="spellEnd"/>
     </w:p>
     <w:p>
       <w:pPr>
@@ -189,7 +230,15 @@
         </w:numPr>
       </w:pPr>
       <w:r>
-        <w:t>Launch LSACreator, load the translation project (sources\localization\</w:t>
+        <w:t xml:space="preserve">Launch </w:t>
+      </w:r>
+      <w:proofErr w:type="spellStart"/>
+      <w:r>
+        <w:t>LSACreator</w:t>
+      </w:r>
+      <w:proofErr w:type="spellEnd"/>
+      <w:r>
+        <w:t>, load the translation project (sources\localization\</w:t>
       </w:r>
       <w:r>
         <w:t>EwE6.lsaproj</w:t>
@@ -246,8 +295,13 @@
         </w:numPr>
       </w:pPr>
       <w:r>
-        <w:t>Commit your changes via TortoiseSVN</w:t>
-      </w:r>
+        <w:t xml:space="preserve">Commit your changes via </w:t>
+      </w:r>
+      <w:proofErr w:type="spellStart"/>
+      <w:r>
+        <w:t>TortoiseSVN</w:t>
+      </w:r>
+      <w:proofErr w:type="spellEnd"/>
     </w:p>
     <w:p>
       <w:pPr>
@@ -258,21 +312,68 @@
       </w:r>
     </w:p>
     <w:p>
-      <w:pPr>
-        <w:pStyle w:val="Heading2"/>
-      </w:pPr>
-      <w:r>
-        <w:t>What to translate</w:t>
-      </w:r>
-    </w:p>
-    <w:p>
-      <w:r>
-        <w:t>h</w:t>
+      <w:proofErr w:type="gramStart"/>
+      <w:r>
+        <w:t>There are several types of resources that needs translating:</w:t>
+      </w:r>
+      <w:proofErr w:type="gramEnd"/>
+    </w:p>
+    <w:p>
+      <w:pPr>
+        <w:pStyle w:val="ListParagraph"/>
+        <w:numPr>
+          <w:ilvl w:val="0"/>
+          <w:numId w:val="6"/>
+        </w:numPr>
+      </w:pPr>
+      <w:r>
+        <w:t>Strings (including button texts)</w:t>
+      </w:r>
+    </w:p>
+    <w:p>
+      <w:pPr>
+        <w:pStyle w:val="ListParagraph"/>
+        <w:numPr>
+          <w:ilvl w:val="0"/>
+          <w:numId w:val="6"/>
+        </w:numPr>
+      </w:pPr>
+      <w:r>
+        <w:t>Images and bitmaps</w:t>
+      </w:r>
+    </w:p>
+    <w:p>
+      <w:pPr>
+        <w:pStyle w:val="ListParagraph"/>
+        <w:numPr>
+          <w:ilvl w:val="0"/>
+          <w:numId w:val="6"/>
+        </w:numPr>
+      </w:pPr>
+      <w:r>
+        <w:t>Sounds</w:t>
+      </w:r>
+    </w:p>
+    <w:p>
+      <w:pPr>
+        <w:pStyle w:val="ListParagraph"/>
+        <w:numPr>
+          <w:ilvl w:val="0"/>
+          <w:numId w:val="6"/>
+        </w:numPr>
+      </w:pPr>
+      <w:r>
+        <w:t>Dialogues</w:t>
+      </w:r>
+    </w:p>
+    <w:p>
+      <w:r>
+        <w:t>LSA creator supports translation of strings, and allows for preview of translated dialogs to assess how well translated text fits within the dialog.</w:t>
       </w:r>
       <w:bookmarkStart w:id="0" w:name="_GoBack"/>
       <w:bookmarkEnd w:id="0"/>
       <w:r>
-        <w:t>ola</w:t>
+        <w:t xml:space="preserve"> </w:t>
       </w:r>
     </w:p>
     <w:p>
@@ -280,7 +381,102 @@
         <w:pStyle w:val="Heading2"/>
       </w:pPr>
       <w:r>
-        <w:t>Special characters</w:t>
+        <w:t>Guidelines</w:t>
+      </w:r>
+    </w:p>
+    <w:p>
+      <w:pPr>
+        <w:pStyle w:val="ListParagraph"/>
+        <w:numPr>
+          <w:ilvl w:val="0"/>
+          <w:numId w:val="5"/>
+        </w:numPr>
+      </w:pPr>
+      <w:r>
+        <w:t>Keep text as short as possible</w:t>
+      </w:r>
+      <w:r>
+        <w:t>, maintain acronyms and variable names</w:t>
+      </w:r>
+    </w:p>
+    <w:p>
+      <w:pPr>
+        <w:pStyle w:val="ListParagraph"/>
+        <w:numPr>
+          <w:ilvl w:val="0"/>
+          <w:numId w:val="5"/>
+        </w:numPr>
+      </w:pPr>
+      <w:r>
+        <w:t>Remove unnecessary spaces introduced  by Google translate</w:t>
+      </w:r>
+    </w:p>
+    <w:p>
+      <w:pPr>
+        <w:pStyle w:val="ListParagraph"/>
+        <w:numPr>
+          <w:ilvl w:val="0"/>
+          <w:numId w:val="5"/>
+        </w:numPr>
+      </w:pPr>
+      <w:r>
+        <w:t xml:space="preserve">Variable names and international acronyms may translate if that is common in a language. For instance, IUCN threat status codes </w:t>
+      </w:r>
+      <w:proofErr w:type="gramStart"/>
+      <w:r>
+        <w:t>may be translated</w:t>
+      </w:r>
+      <w:proofErr w:type="gramEnd"/>
+      <w:r>
+        <w:t xml:space="preserve"> to local equivalents. When in doubt, maintain English.</w:t>
+      </w:r>
+    </w:p>
+    <w:p>
+      <w:pPr>
+        <w:pStyle w:val="ListParagraph"/>
+        <w:numPr>
+          <w:ilvl w:val="0"/>
+          <w:numId w:val="5"/>
+        </w:numPr>
+      </w:pPr>
+      <w:r>
+        <w:t xml:space="preserve">Check and correct all auto-translated text </w:t>
+      </w:r>
+    </w:p>
+    <w:p>
+      <w:pPr>
+        <w:pStyle w:val="ListParagraph"/>
+        <w:numPr>
+          <w:ilvl w:val="0"/>
+          <w:numId w:val="5"/>
+        </w:numPr>
+      </w:pPr>
+      <w:r>
+        <w:t xml:space="preserve">Menu items: </w:t>
+      </w:r>
+      <w:r>
+        <w:t>Capitalize each word and maintain trailing dots (…). Menu items should have a keyboard shortcut (preceded by a ‘&amp;’ character.</w:t>
+      </w:r>
+    </w:p>
+    <w:p>
+      <w:pPr>
+        <w:pStyle w:val="ListParagraph"/>
+        <w:numPr>
+          <w:ilvl w:val="0"/>
+          <w:numId w:val="5"/>
+        </w:numPr>
+      </w:pPr>
+      <w:r>
+        <w:t>Control texts: Capitalize first word. All controls should have a keyboard shortcut character as well (‘&amp;’)</w:t>
+      </w:r>
+    </w:p>
+    <w:p>
+      <w:pPr>
+        <w:pStyle w:val="Heading2"/>
+      </w:pPr>
+      <w:r>
+        <w:lastRenderedPageBreak/>
+        <w:t>What not to translate</w:t>
       </w:r>
     </w:p>
     <w:p>
@@ -292,7 +488,22 @@
         </w:numPr>
       </w:pPr>
       <w:r>
-        <w:t>Keyboard shortcuts: &amp;</w:t>
+        <w:t>Substitution placeholders: {0}, {1}, etc</w:t>
+      </w:r>
+      <w:r>
+        <w:t xml:space="preserve">. </w:t>
+      </w:r>
+      <w:r>
+        <w:br/>
+        <w:t xml:space="preserve">Numbers within accolades are placeholders for actual text fragments that will be substituted in by EwE. The first item will be substituted into {0}, the second into {1}, the third into {2}, etc. For right-to-left </w:t>
+      </w:r>
+      <w:proofErr w:type="gramStart"/>
+      <w:r>
+        <w:t>languages</w:t>
+      </w:r>
+      <w:proofErr w:type="gramEnd"/>
+      <w:r>
+        <w:t xml:space="preserve"> you will need to switch the order of these arguments.</w:t>
       </w:r>
     </w:p>
     <w:p>
@@ -304,19 +515,13 @@
         </w:numPr>
       </w:pPr>
       <w:r>
-        <w:t>Dialog indicators: …</w:t>
-      </w:r>
-    </w:p>
-    <w:p>
-      <w:pPr>
-        <w:pStyle w:val="ListParagraph"/>
-        <w:numPr>
-          <w:ilvl w:val="0"/>
-          <w:numId w:val="4"/>
-        </w:numPr>
-      </w:pPr>
-      <w:r>
-        <w:t>Substitution placeholders: {0}, {1}, etc</w:t>
+        <w:t>Generic placeholders</w:t>
+      </w:r>
+      <w:r>
+        <w:t>: &lt;…&gt;</w:t>
+      </w:r>
+      <w:r>
+        <w:t>. These fields will receive their content entirely from elsewhere, and you do not need to worry about translating these. If you do, your translation will not be visible anywhere</w:t>
       </w:r>
     </w:p>
     <w:p>
@@ -355,7 +560,7 @@
 </file>
 
 <file path=word/numbering.xml><?xml version="1.0" encoding="utf-8"?>
-<w:numbering xmlns:wpc="http://schemas.microsoft.com/office/word/2010/wordprocessingCanvas" xmlns:cx="http://schemas.microsoft.com/office/drawing/2014/chartex" xmlns:cx1="http://schemas.microsoft.com/office/drawing/2015/9/8/chartex" xmlns:cx2="http://schemas.microsoft.com/office/drawing/2015/10/21/chartex" xmlns:cx3="http://schemas.microsoft.com/office/drawing/2016/5/9/chartex" xmlns:cx4="http://schemas.microsoft.com/office/drawing/2016/5/10/chartex" xmlns:cx5="http://schemas.microsoft.com/office/drawing/2016/5/11/chartex" xmlns:cx6="http://schemas.microsoft.com/office/drawing/2016/5/12/chartex" xmlns:cx7="http://schemas.microsoft.com/office/drawing/2016/5/13/chartex" xmlns:cx8="http://schemas.microsoft.com/office/drawing/2016/5/14/chartex" xmlns:mc="http://schemas.openxmlformats.org/markup-compatibility/2006" xmlns:aink="http://schemas.microsoft.com/office/drawing/2016/ink" xmlns:am3d="http://schemas.microsoft.com/office/drawing/2017/model3d" xmlns:o="urn:schemas-microsoft-com:office:office" xmlns:r="http://schemas.openxmlformats.org/officeDocument/2006/relationships" xmlns:m="http://schemas.openxmlformats.org/officeDocument/2006/math" xmlns:v="urn:schemas-microsoft-com:vml" xmlns:wp14="http://schemas.microsoft.com/office/word/2010/wordprocessingDrawing" xmlns:wp="http://schemas.openxmlformats.org/drawingml/2006/wordprocessingDrawing" xmlns:w10="urn:schemas-microsoft-com:office:word" xmlns:w="http://schemas.openxmlformats.org/wordprocessingml/2006/main" xmlns:w14="http://schemas.microsoft.com/office/word/2010/wordml" xmlns:w15="http://schemas.microsoft.com/office/word/2012/wordml" xmlns:w16cid="http://schemas.microsoft.com/office/word/2016/wordml/cid" xmlns:w16se="http://schemas.microsoft.com/office/word/2015/wordml/symex" xmlns:wpg="http://schemas.microsoft.com/office/word/2010/wordprocessingGroup" xmlns:wpi="http://schemas.microsoft.com/office/word/2010/wordprocessingInk" xmlns:wne="http://schemas.microsoft.com/office/word/2006/wordml" xmlns:wps="http://schemas.microsoft.com/office/word/2010/wordprocessingShape" mc:Ignorable="w14 w15 w16se w16cid wp14">
+<w:numbering xmlns:wpc="http://schemas.microsoft.com/office/word/2010/wordprocessingCanvas" xmlns:cx="http://schemas.microsoft.com/office/drawing/2014/chartex" xmlns:cx1="http://schemas.microsoft.com/office/drawing/2015/9/8/chartex" xmlns:mc="http://schemas.openxmlformats.org/markup-compatibility/2006" xmlns:o="urn:schemas-microsoft-com:office:office" xmlns:r="http://schemas.openxmlformats.org/officeDocument/2006/relationships" xmlns:m="http://schemas.openxmlformats.org/officeDocument/2006/math" xmlns:v="urn:schemas-microsoft-com:vml" xmlns:wp14="http://schemas.microsoft.com/office/word/2010/wordprocessingDrawing" xmlns:wp="http://schemas.openxmlformats.org/drawingml/2006/wordprocessingDrawing" xmlns:w10="urn:schemas-microsoft-com:office:word" xmlns:w="http://schemas.openxmlformats.org/wordprocessingml/2006/main" xmlns:w14="http://schemas.microsoft.com/office/word/2010/wordml" xmlns:w15="http://schemas.microsoft.com/office/word/2012/wordml" xmlns:w16se="http://schemas.microsoft.com/office/word/2015/wordml/symex" xmlns:wpg="http://schemas.microsoft.com/office/word/2010/wordprocessingGroup" xmlns:wpi="http://schemas.microsoft.com/office/word/2010/wordprocessingInk" xmlns:wne="http://schemas.microsoft.com/office/word/2006/wordml" xmlns:wps="http://schemas.microsoft.com/office/word/2010/wordprocessingShape" mc:Ignorable="w14 w15 w16se wp14">
   <w:abstractNum w:abstractNumId="0" w15:restartNumberingAfterBreak="0">
     <w:nsid w:val="1EA25712"/>
     <w:multiLevelType w:val="hybridMultilevel"/>
@@ -583,6 +788,119 @@
     </w:lvl>
   </w:abstractNum>
   <w:abstractNum w:abstractNumId="2" w15:restartNumberingAfterBreak="0">
+    <w:nsid w:val="25A438BD"/>
+    <w:multiLevelType w:val="hybridMultilevel"/>
+    <w:tmpl w:val="C6D8053A"/>
+    <w:lvl w:ilvl="0" w:tplc="08090001">
+      <w:start w:val="1"/>
+      <w:numFmt w:val="bullet"/>
+      <w:lvlText w:val=""/>
+      <w:lvlJc w:val="left"/>
+      <w:pPr>
+        <w:ind w:left="720" w:hanging="360"/>
+      </w:pPr>
+      <w:rPr>
+        <w:rFonts w:ascii="Symbol" w:hAnsi="Symbol" w:hint="default"/>
+      </w:rPr>
+    </w:lvl>
+    <w:lvl w:ilvl="1" w:tplc="08090003" w:tentative="1">
+      <w:start w:val="1"/>
+      <w:numFmt w:val="bullet"/>
+      <w:lvlText w:val="o"/>
+      <w:lvlJc w:val="left"/>
+      <w:pPr>
+        <w:ind w:left="1440" w:hanging="360"/>
+      </w:pPr>
+      <w:rPr>
+        <w:rFonts w:ascii="Courier New" w:hAnsi="Courier New" w:cs="Courier New" w:hint="default"/>
+      </w:rPr>
+    </w:lvl>
+    <w:lvl w:ilvl="2" w:tplc="08090005" w:tentative="1">
+      <w:start w:val="1"/>
+      <w:numFmt w:val="bullet"/>
+      <w:lvlText w:val=""/>
+      <w:lvlJc w:val="left"/>
+      <w:pPr>
+        <w:ind w:left="2160" w:hanging="360"/>
+      </w:pPr>
+      <w:rPr>
+        <w:rFonts w:ascii="Wingdings" w:hAnsi="Wingdings" w:hint="default"/>
+      </w:rPr>
+    </w:lvl>
+    <w:lvl w:ilvl="3" w:tplc="08090001" w:tentative="1">
+      <w:start w:val="1"/>
+      <w:numFmt w:val="bullet"/>
+      <w:lvlText w:val=""/>
+      <w:lvlJc w:val="left"/>
+      <w:pPr>
+        <w:ind w:left="2880" w:hanging="360"/>
+      </w:pPr>
+      <w:rPr>
+        <w:rFonts w:ascii="Symbol" w:hAnsi="Symbol" w:hint="default"/>
+      </w:rPr>
+    </w:lvl>
+    <w:lvl w:ilvl="4" w:tplc="08090003" w:tentative="1">
+      <w:start w:val="1"/>
+      <w:numFmt w:val="bullet"/>
+      <w:lvlText w:val="o"/>
+      <w:lvlJc w:val="left"/>
+      <w:pPr>
+        <w:ind w:left="3600" w:hanging="360"/>
+      </w:pPr>
+      <w:rPr>
+        <w:rFonts w:ascii="Courier New" w:hAnsi="Courier New" w:cs="Courier New" w:hint="default"/>
+      </w:rPr>
+    </w:lvl>
+    <w:lvl w:ilvl="5" w:tplc="08090005" w:tentative="1">
+      <w:start w:val="1"/>
+      <w:numFmt w:val="bullet"/>
+      <w:lvlText w:val=""/>
+      <w:lvlJc w:val="left"/>
+      <w:pPr>
+        <w:ind w:left="4320" w:hanging="360"/>
+      </w:pPr>
+      <w:rPr>
+        <w:rFonts w:ascii="Wingdings" w:hAnsi="Wingdings" w:hint="default"/>
+      </w:rPr>
+    </w:lvl>
+    <w:lvl w:ilvl="6" w:tplc="08090001" w:tentative="1">
+      <w:start w:val="1"/>
+      <w:numFmt w:val="bullet"/>
+      <w:lvlText w:val=""/>
+      <w:lvlJc w:val="left"/>
+      <w:pPr>
+        <w:ind w:left="5040" w:hanging="360"/>
+      </w:pPr>
+      <w:rPr>
+        <w:rFonts w:ascii="Symbol" w:hAnsi="Symbol" w:hint="default"/>
+      </w:rPr>
+    </w:lvl>
+    <w:lvl w:ilvl="7" w:tplc="08090003" w:tentative="1">
+      <w:start w:val="1"/>
+      <w:numFmt w:val="bullet"/>
+      <w:lvlText w:val="o"/>
+      <w:lvlJc w:val="left"/>
+      <w:pPr>
+        <w:ind w:left="5760" w:hanging="360"/>
+      </w:pPr>
+      <w:rPr>
+        <w:rFonts w:ascii="Courier New" w:hAnsi="Courier New" w:cs="Courier New" w:hint="default"/>
+      </w:rPr>
+    </w:lvl>
+    <w:lvl w:ilvl="8" w:tplc="08090005" w:tentative="1">
+      <w:start w:val="1"/>
+      <w:numFmt w:val="bullet"/>
+      <w:lvlText w:val=""/>
+      <w:lvlJc w:val="left"/>
+      <w:pPr>
+        <w:ind w:left="6480" w:hanging="360"/>
+      </w:pPr>
+      <w:rPr>
+        <w:rFonts w:ascii="Wingdings" w:hAnsi="Wingdings" w:hint="default"/>
+      </w:rPr>
+    </w:lvl>
+  </w:abstractNum>
+  <w:abstractNum w:abstractNumId="3" w15:restartNumberingAfterBreak="0">
     <w:nsid w:val="353B630D"/>
     <w:multiLevelType w:val="hybridMultilevel"/>
     <w:tmpl w:val="7CF40832"/>
@@ -695,7 +1013,120 @@
       </w:rPr>
     </w:lvl>
   </w:abstractNum>
-  <w:abstractNum w:abstractNumId="3" w15:restartNumberingAfterBreak="0">
+  <w:abstractNum w:abstractNumId="4" w15:restartNumberingAfterBreak="0">
+    <w:nsid w:val="52500B91"/>
+    <w:multiLevelType w:val="hybridMultilevel"/>
+    <w:tmpl w:val="C87E4838"/>
+    <w:lvl w:ilvl="0" w:tplc="08090001">
+      <w:start w:val="1"/>
+      <w:numFmt w:val="bullet"/>
+      <w:lvlText w:val=""/>
+      <w:lvlJc w:val="left"/>
+      <w:pPr>
+        <w:ind w:left="720" w:hanging="360"/>
+      </w:pPr>
+      <w:rPr>
+        <w:rFonts w:ascii="Symbol" w:hAnsi="Symbol" w:hint="default"/>
+      </w:rPr>
+    </w:lvl>
+    <w:lvl w:ilvl="1" w:tplc="08090003" w:tentative="1">
+      <w:start w:val="1"/>
+      <w:numFmt w:val="bullet"/>
+      <w:lvlText w:val="o"/>
+      <w:lvlJc w:val="left"/>
+      <w:pPr>
+        <w:ind w:left="1440" w:hanging="360"/>
+      </w:pPr>
+      <w:rPr>
+        <w:rFonts w:ascii="Courier New" w:hAnsi="Courier New" w:cs="Courier New" w:hint="default"/>
+      </w:rPr>
+    </w:lvl>
+    <w:lvl w:ilvl="2" w:tplc="08090005" w:tentative="1">
+      <w:start w:val="1"/>
+      <w:numFmt w:val="bullet"/>
+      <w:lvlText w:val=""/>
+      <w:lvlJc w:val="left"/>
+      <w:pPr>
+        <w:ind w:left="2160" w:hanging="360"/>
+      </w:pPr>
+      <w:rPr>
+        <w:rFonts w:ascii="Wingdings" w:hAnsi="Wingdings" w:hint="default"/>
+      </w:rPr>
+    </w:lvl>
+    <w:lvl w:ilvl="3" w:tplc="08090001" w:tentative="1">
+      <w:start w:val="1"/>
+      <w:numFmt w:val="bullet"/>
+      <w:lvlText w:val=""/>
+      <w:lvlJc w:val="left"/>
+      <w:pPr>
+        <w:ind w:left="2880" w:hanging="360"/>
+      </w:pPr>
+      <w:rPr>
+        <w:rFonts w:ascii="Symbol" w:hAnsi="Symbol" w:hint="default"/>
+      </w:rPr>
+    </w:lvl>
+    <w:lvl w:ilvl="4" w:tplc="08090003" w:tentative="1">
+      <w:start w:val="1"/>
+      <w:numFmt w:val="bullet"/>
+      <w:lvlText w:val="o"/>
+      <w:lvlJc w:val="left"/>
+      <w:pPr>
+        <w:ind w:left="3600" w:hanging="360"/>
+      </w:pPr>
+      <w:rPr>
+        <w:rFonts w:ascii="Courier New" w:hAnsi="Courier New" w:cs="Courier New" w:hint="default"/>
+      </w:rPr>
+    </w:lvl>
+    <w:lvl w:ilvl="5" w:tplc="08090005" w:tentative="1">
+      <w:start w:val="1"/>
+      <w:numFmt w:val="bullet"/>
+      <w:lvlText w:val=""/>
+      <w:lvlJc w:val="left"/>
+      <w:pPr>
+        <w:ind w:left="4320" w:hanging="360"/>
+      </w:pPr>
+      <w:rPr>
+        <w:rFonts w:ascii="Wingdings" w:hAnsi="Wingdings" w:hint="default"/>
+      </w:rPr>
+    </w:lvl>
+    <w:lvl w:ilvl="6" w:tplc="08090001" w:tentative="1">
+      <w:start w:val="1"/>
+      <w:numFmt w:val="bullet"/>
+      <w:lvlText w:val=""/>
+      <w:lvlJc w:val="left"/>
+      <w:pPr>
+        <w:ind w:left="5040" w:hanging="360"/>
+      </w:pPr>
+      <w:rPr>
+        <w:rFonts w:ascii="Symbol" w:hAnsi="Symbol" w:hint="default"/>
+      </w:rPr>
+    </w:lvl>
+    <w:lvl w:ilvl="7" w:tplc="08090003" w:tentative="1">
+      <w:start w:val="1"/>
+      <w:numFmt w:val="bullet"/>
+      <w:lvlText w:val="o"/>
+      <w:lvlJc w:val="left"/>
+      <w:pPr>
+        <w:ind w:left="5760" w:hanging="360"/>
+      </w:pPr>
+      <w:rPr>
+        <w:rFonts w:ascii="Courier New" w:hAnsi="Courier New" w:cs="Courier New" w:hint="default"/>
+      </w:rPr>
+    </w:lvl>
+    <w:lvl w:ilvl="8" w:tplc="08090005" w:tentative="1">
+      <w:start w:val="1"/>
+      <w:numFmt w:val="bullet"/>
+      <w:lvlText w:val=""/>
+      <w:lvlJc w:val="left"/>
+      <w:pPr>
+        <w:ind w:left="6480" w:hanging="360"/>
+      </w:pPr>
+      <w:rPr>
+        <w:rFonts w:ascii="Wingdings" w:hAnsi="Wingdings" w:hint="default"/>
+      </w:rPr>
+    </w:lvl>
+  </w:abstractNum>
+  <w:abstractNum w:abstractNumId="5" w15:restartNumberingAfterBreak="0">
     <w:nsid w:val="797A1A0C"/>
     <w:multiLevelType w:val="hybridMultilevel"/>
     <w:tmpl w:val="D57C8FD4"/>
@@ -809,22 +1240,28 @@
     </w:lvl>
   </w:abstractNum>
   <w:num w:numId="1">
-    <w:abstractNumId w:val="2"/>
+    <w:abstractNumId w:val="3"/>
   </w:num>
   <w:num w:numId="2">
     <w:abstractNumId w:val="0"/>
   </w:num>
   <w:num w:numId="3">
-    <w:abstractNumId w:val="3"/>
+    <w:abstractNumId w:val="5"/>
   </w:num>
   <w:num w:numId="4">
     <w:abstractNumId w:val="1"/>
+  </w:num>
+  <w:num w:numId="5">
+    <w:abstractNumId w:val="2"/>
+  </w:num>
+  <w:num w:numId="6">
+    <w:abstractNumId w:val="4"/>
   </w:num>
 </w:numbering>
 </file>
 
 <file path=word/styles.xml><?xml version="1.0" encoding="utf-8"?>
-<w:styles xmlns:mc="http://schemas.openxmlformats.org/markup-compatibility/2006" xmlns:r="http://schemas.openxmlformats.org/officeDocument/2006/relationships" xmlns:w="http://schemas.openxmlformats.org/wordprocessingml/2006/main" xmlns:w14="http://schemas.microsoft.com/office/word/2010/wordml" xmlns:w15="http://schemas.microsoft.com/office/word/2012/wordml" xmlns:w16cid="http://schemas.microsoft.com/office/word/2016/wordml/cid" xmlns:w16se="http://schemas.microsoft.com/office/word/2015/wordml/symex" mc:Ignorable="w14 w15 w16se w16cid">
+<w:styles xmlns:mc="http://schemas.openxmlformats.org/markup-compatibility/2006" xmlns:r="http://schemas.openxmlformats.org/officeDocument/2006/relationships" xmlns:w="http://schemas.openxmlformats.org/wordprocessingml/2006/main" xmlns:w14="http://schemas.microsoft.com/office/word/2010/wordml" xmlns:w15="http://schemas.microsoft.com/office/word/2012/wordml" xmlns:w16se="http://schemas.microsoft.com/office/word/2015/wordml/symex" mc:Ignorable="w14 w15 w16se">
   <w:docDefaults>
     <w:rPrDefault>
       <w:rPr>
@@ -840,7 +1277,7 @@
       </w:pPr>
     </w:pPrDefault>
   </w:docDefaults>
-  <w:latentStyles w:defLockedState="0" w:defUIPriority="99" w:defSemiHidden="0" w:defUnhideWhenUsed="0" w:defQFormat="0" w:count="376">
+  <w:latentStyles w:defLockedState="0" w:defUIPriority="99" w:defSemiHidden="0" w:defUnhideWhenUsed="0" w:defQFormat="0" w:count="371">
     <w:lsdException w:name="Normal" w:uiPriority="0" w:qFormat="1"/>
     <w:lsdException w:name="heading 1" w:uiPriority="9" w:qFormat="1"/>
     <w:lsdException w:name="heading 2" w:semiHidden="1" w:uiPriority="9" w:unhideWhenUsed="1" w:qFormat="1"/>
@@ -946,6 +1383,7 @@
     <w:lsdException w:name="HTML Sample" w:semiHidden="1" w:unhideWhenUsed="1"/>
     <w:lsdException w:name="HTML Typewriter" w:semiHidden="1" w:unhideWhenUsed="1"/>
     <w:lsdException w:name="HTML Variable" w:semiHidden="1" w:unhideWhenUsed="1"/>
+    <w:lsdException w:name="Normal Table" w:semiHidden="1" w:unhideWhenUsed="1"/>
     <w:lsdException w:name="annotation subject" w:semiHidden="1" w:unhideWhenUsed="1"/>
     <w:lsdException w:name="No List" w:semiHidden="1" w:unhideWhenUsed="1"/>
     <w:lsdException w:name="Outline List 1" w:semiHidden="1" w:unhideWhenUsed="1"/>
@@ -988,8 +1426,11 @@
     <w:lsdException w:name="Table Contemporary" w:semiHidden="1" w:unhideWhenUsed="1"/>
     <w:lsdException w:name="Table Elegant" w:semiHidden="1" w:unhideWhenUsed="1"/>
     <w:lsdException w:name="Table Professional" w:semiHidden="1" w:unhideWhenUsed="1"/>
+    <w:lsdException w:name="Table Subtle 1" w:semiHidden="1" w:unhideWhenUsed="1"/>
     <w:lsdException w:name="Table Subtle 2" w:semiHidden="1" w:unhideWhenUsed="1"/>
     <w:lsdException w:name="Table Web 1" w:semiHidden="1" w:unhideWhenUsed="1"/>
+    <w:lsdException w:name="Table Web 2" w:semiHidden="1" w:unhideWhenUsed="1"/>
+    <w:lsdException w:name="Table Web 3" w:semiHidden="1" w:unhideWhenUsed="1"/>
     <w:lsdException w:name="Balloon Text" w:semiHidden="1" w:unhideWhenUsed="1"/>
     <w:lsdException w:name="Table Grid" w:uiPriority="39"/>
     <w:lsdException w:name="Table Theme" w:semiHidden="1" w:unhideWhenUsed="1"/>
@@ -1208,11 +1649,6 @@
     <w:lsdException w:name="List Table 5 Dark Accent 6" w:uiPriority="50"/>
     <w:lsdException w:name="List Table 6 Colorful Accent 6" w:uiPriority="51"/>
     <w:lsdException w:name="List Table 7 Colorful Accent 6" w:uiPriority="52"/>
-    <w:lsdException w:name="Mention" w:semiHidden="1" w:unhideWhenUsed="1"/>
-    <w:lsdException w:name="Smart Hyperlink" w:semiHidden="1" w:unhideWhenUsed="1"/>
-    <w:lsdException w:name="Hashtag" w:semiHidden="1" w:unhideWhenUsed="1"/>
-    <w:lsdException w:name="Unresolved Mention" w:semiHidden="1" w:unhideWhenUsed="1"/>
-    <w:lsdException w:name="Smart Link" w:semiHidden="1" w:unhideWhenUsed="1"/>
   </w:latentStyles>
   <w:style w:type="paragraph" w:default="1" w:styleId="Normal">
     <w:name w:val="Normal"/>

</xml_diff>